<commit_message>
docs: completar evidencia Git y version final del informe
</commit_message>
<xml_diff>
--- a/Informe_Backend.docx
+++ b/Informe_Backend.docx
@@ -627,7 +627,6 @@
         </w:tc>
       </w:tr>
     </w:tbl>
-    <w:p/>
     <w:p>
       <w:pPr>
         <w:pStyle w:val="Heading1"/>
@@ -678,7 +677,7 @@
         <w:pStyle w:val="ListBullet"/>
       </w:pPr>
       <w:r>
-        <w:t>evidencias/: capturas del flujo de prueba y del historial Git.</w:t>
+        <w:t>evidencias/: capturas del flujo de prueba y trazabilidad del repositorio.</w:t>
       </w:r>
     </w:p>
     <w:p>
@@ -1180,7 +1179,7 @@
       <w:r>
         <w:drawing>
           <wp:inline xmlns:a="http://schemas.openxmlformats.org/drawingml/2006/main" xmlns:pic="http://schemas.openxmlformats.org/drawingml/2006/picture">
-            <wp:extent cx="5394960" cy="1711505"/>
+            <wp:extent cx="5349240" cy="1697000"/>
             <wp:docPr id="2" name="Picture 2"/>
             <wp:cNvGraphicFramePr>
               <a:graphicFrameLocks noChangeAspect="1"/>
@@ -1201,7 +1200,7 @@
                   <pic:spPr>
                     <a:xfrm>
                       <a:off x="0" y="0"/>
-                      <a:ext cx="5394960" cy="1711505"/>
+                      <a:ext cx="5349240" cy="1697000"/>
                     </a:xfrm>
                     <a:prstGeom prst="rect"/>
                   </pic:spPr>
@@ -1241,7 +1240,7 @@
       <w:r>
         <w:drawing>
           <wp:inline xmlns:a="http://schemas.openxmlformats.org/drawingml/2006/main" xmlns:pic="http://schemas.openxmlformats.org/drawingml/2006/picture">
-            <wp:extent cx="5394960" cy="2269604"/>
+            <wp:extent cx="5349240" cy="2250370"/>
             <wp:docPr id="3" name="Picture 3"/>
             <wp:cNvGraphicFramePr>
               <a:graphicFrameLocks noChangeAspect="1"/>
@@ -1262,7 +1261,7 @@
                   <pic:spPr>
                     <a:xfrm>
                       <a:off x="0" y="0"/>
-                      <a:ext cx="5394960" cy="2269604"/>
+                      <a:ext cx="5349240" cy="2250370"/>
                     </a:xfrm>
                     <a:prstGeom prst="rect"/>
                   </pic:spPr>
@@ -1302,7 +1301,7 @@
       <w:r>
         <w:drawing>
           <wp:inline xmlns:a="http://schemas.openxmlformats.org/drawingml/2006/main" xmlns:pic="http://schemas.openxmlformats.org/drawingml/2006/picture">
-            <wp:extent cx="5394960" cy="1711505"/>
+            <wp:extent cx="5349240" cy="1697000"/>
             <wp:docPr id="4" name="Picture 4"/>
             <wp:cNvGraphicFramePr>
               <a:graphicFrameLocks noChangeAspect="1"/>
@@ -1323,7 +1322,7 @@
                   <pic:spPr>
                     <a:xfrm>
                       <a:off x="0" y="0"/>
-                      <a:ext cx="5394960" cy="1711505"/>
+                      <a:ext cx="5349240" cy="1697000"/>
                     </a:xfrm>
                     <a:prstGeom prst="rect"/>
                   </pic:spPr>
@@ -1363,7 +1362,7 @@
       <w:r>
         <w:drawing>
           <wp:inline xmlns:a="http://schemas.openxmlformats.org/drawingml/2006/main" xmlns:pic="http://schemas.openxmlformats.org/drawingml/2006/picture">
-            <wp:extent cx="5394960" cy="2046364"/>
+            <wp:extent cx="5349240" cy="2029022"/>
             <wp:docPr id="5" name="Picture 5"/>
             <wp:cNvGraphicFramePr>
               <a:graphicFrameLocks noChangeAspect="1"/>
@@ -1384,7 +1383,7 @@
                   <pic:spPr>
                     <a:xfrm>
                       <a:off x="0" y="0"/>
-                      <a:ext cx="5394960" cy="2046364"/>
+                      <a:ext cx="5349240" cy="2029022"/>
                     </a:xfrm>
                     <a:prstGeom prst="rect"/>
                   </pic:spPr>
@@ -1424,7 +1423,7 @@
       <w:r>
         <w:drawing>
           <wp:inline xmlns:a="http://schemas.openxmlformats.org/drawingml/2006/main" xmlns:pic="http://schemas.openxmlformats.org/drawingml/2006/picture">
-            <wp:extent cx="5394960" cy="1823124"/>
+            <wp:extent cx="5349240" cy="1807674"/>
             <wp:docPr id="6" name="Picture 6"/>
             <wp:cNvGraphicFramePr>
               <a:graphicFrameLocks noChangeAspect="1"/>
@@ -1445,7 +1444,7 @@
                   <pic:spPr>
                     <a:xfrm>
                       <a:off x="0" y="0"/>
-                      <a:ext cx="5394960" cy="1823124"/>
+                      <a:ext cx="5349240" cy="1807674"/>
                     </a:xfrm>
                     <a:prstGeom prst="rect"/>
                   </pic:spPr>
@@ -1485,7 +1484,7 @@
       <w:r>
         <w:drawing>
           <wp:inline xmlns:a="http://schemas.openxmlformats.org/drawingml/2006/main" xmlns:pic="http://schemas.openxmlformats.org/drawingml/2006/picture">
-            <wp:extent cx="5394960" cy="1711505"/>
+            <wp:extent cx="5349240" cy="1697000"/>
             <wp:docPr id="7" name="Picture 7"/>
             <wp:cNvGraphicFramePr>
               <a:graphicFrameLocks noChangeAspect="1"/>
@@ -1506,7 +1505,7 @@
                   <pic:spPr>
                     <a:xfrm>
                       <a:off x="0" y="0"/>
-                      <a:ext cx="5394960" cy="1711505"/>
+                      <a:ext cx="5349240" cy="1697000"/>
                     </a:xfrm>
                     <a:prstGeom prst="rect"/>
                   </pic:spPr>
@@ -1581,6 +1580,102 @@
       </w:r>
     </w:p>
     <w:p>
+      <w:r>
+        <w:drawing>
+          <wp:inline xmlns:a="http://schemas.openxmlformats.org/drawingml/2006/main" xmlns:pic="http://schemas.openxmlformats.org/drawingml/2006/picture">
+            <wp:extent cx="5349240" cy="2559993"/>
+            <wp:docPr id="8" name="Picture 8"/>
+            <wp:cNvGraphicFramePr>
+              <a:graphicFrameLocks noChangeAspect="1"/>
+            </wp:cNvGraphicFramePr>
+            <a:graphic>
+              <a:graphicData uri="http://schemas.openxmlformats.org/drawingml/2006/picture">
+                <pic:pic>
+                  <pic:nvPicPr>
+                    <pic:cNvPr id="0" name="git_historial_ramas.png"/>
+                    <pic:cNvPicPr/>
+                  </pic:nvPicPr>
+                  <pic:blipFill>
+                    <a:blip r:embed="rId16"/>
+                    <a:stretch>
+                      <a:fillRect/>
+                    </a:stretch>
+                  </pic:blipFill>
+                  <pic:spPr>
+                    <a:xfrm>
+                      <a:off x="0" y="0"/>
+                      <a:ext cx="5349240" cy="2559993"/>
+                    </a:xfrm>
+                    <a:prstGeom prst="rect"/>
+                  </pic:spPr>
+                </pic:pic>
+              </a:graphicData>
+            </a:graphic>
+          </wp:inline>
+        </w:drawing>
+      </w:r>
+    </w:p>
+    <w:p>
+      <w:pPr>
+        <w:jc w:val="center"/>
+      </w:pPr>
+      <w:r>
+        <w:rPr>
+          <w:i/>
+          <w:sz w:val="18"/>
+        </w:rPr>
+        <w:t>Figura 2. Historial de commits y merges del repositorio local.</w:t>
+      </w:r>
+    </w:p>
+    <w:p>
+      <w:r>
+        <w:drawing>
+          <wp:inline xmlns:a="http://schemas.openxmlformats.org/drawingml/2006/main" xmlns:pic="http://schemas.openxmlformats.org/drawingml/2006/picture">
+            <wp:extent cx="5029200" cy="1113609"/>
+            <wp:docPr id="9" name="Picture 9"/>
+            <wp:cNvGraphicFramePr>
+              <a:graphicFrameLocks noChangeAspect="1"/>
+            </wp:cNvGraphicFramePr>
+            <a:graphic>
+              <a:graphicData uri="http://schemas.openxmlformats.org/drawingml/2006/picture">
+                <pic:pic>
+                  <pic:nvPicPr>
+                    <pic:cNvPr id="0" name="git_ramas.png"/>
+                    <pic:cNvPicPr/>
+                  </pic:nvPicPr>
+                  <pic:blipFill>
+                    <a:blip r:embed="rId17"/>
+                    <a:stretch>
+                      <a:fillRect/>
+                    </a:stretch>
+                  </pic:blipFill>
+                  <pic:spPr>
+                    <a:xfrm>
+                      <a:off x="0" y="0"/>
+                      <a:ext cx="5029200" cy="1113609"/>
+                    </a:xfrm>
+                    <a:prstGeom prst="rect"/>
+                  </pic:spPr>
+                </pic:pic>
+              </a:graphicData>
+            </a:graphic>
+          </wp:inline>
+        </w:drawing>
+      </w:r>
+    </w:p>
+    <w:p>
+      <w:pPr>
+        <w:jc w:val="center"/>
+      </w:pPr>
+      <w:r>
+        <w:rPr>
+          <w:i/>
+          <w:sz w:val="18"/>
+        </w:rPr>
+        <w:t>Figura 3. Ramas funcionales creadas para el desarrollo individual.</w:t>
+      </w:r>
+    </w:p>
+    <w:p>
       <w:pPr>
         <w:pStyle w:val="Heading1"/>
       </w:pPr>
@@ -1591,6 +1686,11 @@
     <w:p>
       <w:r>
         <w:t>El backend implementado cumple con el núcleo técnico solicitado: autenticación con Express.js, JWT, cookie httpOnly, middleware de protección y cierre de sesión. Además, la entrega incorpora documentación clara, pruebas reproducibles y un historial Git ordenado. El resultado final es coherente con el objetivo de la unidad de programación segura.</w:t>
+      </w:r>
+    </w:p>
+    <w:p>
+      <w:r>
+        <w:br w:type="page"/>
       </w:r>
     </w:p>
     <w:p>

</xml_diff>